<commit_message>
Fold Honors College into A&S placement instead of a separate row
Per the CR Thematic Model's "Honors College & A&S" cross-cutting note,
call out Honors College explicitly in the A&S table row and the
cross-cutting priorities bullet, without giving it its own placement.

Co-Authored-By: Claude Sonnet 5 <noreply@anthropic.com>
Claude-Session: https://claude.ai/code/session_01FhxUCB16F1qB3VN7HjTG9R
</commit_message>
<xml_diff>
--- a/docs/CR_School_Placement_Model.docx
+++ b/docs/CR_School_Placement_Model.docx
@@ -1396,7 +1396,7 @@
                 <w:sz w:val="20"/>
                 <w:szCs w:val="20"/>
               </w:rPr>
-              <w:t xml:space="preserve">College &amp; Graduate School of Arts &amp; Sciences</w:t>
+              <w:t xml:space="preserve">College &amp; Graduate School of Arts &amp; Sciences (incl. Honors College)</w:t>
             </w:r>
           </w:p>
         </w:tc>
@@ -1431,7 +1431,7 @@
                 <w:sz w:val="20"/>
                 <w:szCs w:val="20"/>
               </w:rPr>
-              <w:t xml:space="preserve">Pre-existing relationships managed on an ongoing basis with industry partners; spans all five research themes across A&amp;S departments.</w:t>
+              <w:t xml:space="preserve">Pre-existing relationships managed on an ongoing basis with industry partners; spans all five research themes across A&amp;S departments. Honors College engagement is folded into this placement rather than tracked separately.</w:t>
             </w:r>
           </w:p>
         </w:tc>
@@ -3772,7 +3772,7 @@
           <w:sz w:val="21"/>
           <w:szCs w:val="21"/>
         </w:rPr>
-        <w:t xml:space="preserve">Arts &amp; Sciences — </w:t>
+        <w:t xml:space="preserve">Arts &amp; Sciences (incl. Honors College) — </w:t>
       </w:r>
       <w:r>
         <w:rPr>
@@ -3781,7 +3781,7 @@
           <w:sz w:val="21"/>
           <w:szCs w:val="21"/>
         </w:rPr>
-        <w:t xml:space="preserve">as the College builds its corporate engagement strategy, both officers support thematically relevant prospect identification and faculty introductions across A&amp;S departments.</w:t>
+        <w:t xml:space="preserve">as the College builds its corporate engagement strategy, both officers support thematically relevant prospect identification and faculty introductions across A&amp;S departments and the Honors College.</w:t>
       </w:r>
     </w:p>
     <w:p>

</xml_diff>

<commit_message>
Add Athletics to Ryan's placement list; verify all columns filled
Adds an Athletics row to Officer 1's (Ryan Weigand) table, covering
corporate sponsorship, licensing, facilities, and multimedia-rights
partnerships, coordinated with UVA Athletics' own corporate
partnerships function. Marked cross-cutting since athletics
sponsorship sits outside the five academic research themes.

Confirmed no blank cells remain anywhere in the document (School/Unit,
Aligned Centers, and Theme Lens columns all populated across both
officer tables and the pan-university priorities table).

Co-Authored-By: Claude Sonnet 5 <noreply@anthropic.com>
Claude-Session: https://claude.ai/code/session_01FhxUCB16F1qB3VN7HjTG9R
</commit_message>
<xml_diff>
--- a/docs/CR_School_Placement_Model.docx
+++ b/docs/CR_School_Placement_Model.docx
@@ -1789,7 +1789,7 @@
                 <w:sz w:val="20"/>
                 <w:szCs w:val="20"/>
               </w:rPr>
-              <w:t xml:space="preserve">UVA Library</w:t>
+              <w:t xml:space="preserve">Athletics</w:t>
             </w:r>
           </w:p>
         </w:tc>
@@ -1824,6 +1824,137 @@
                 <w:sz w:val="20"/>
                 <w:szCs w:val="20"/>
               </w:rPr>
+              <w:t xml:space="preserve">Corporate sponsorship, licensing, facilities, and multimedia-rights partnerships (e.g., apparel, technology, and beverage sponsors). Coordinated closely with UVA Athletics' own corporate partnerships/multimedia-rights function to avoid duplication.</w:t>
+            </w:r>
+          </w:p>
+        </w:tc>
+        <w:tc>
+          <w:tcPr>
+            <w:tcW w:type="dxa" w:w="2600"/>
+            <w:tcBorders>
+              <w:top w:val="single" w:color="D9DCE3" w:sz="2"/>
+              <w:left w:val="single" w:color="D9DCE3" w:sz="2"/>
+              <w:bottom w:val="single" w:color="D9DCE3" w:sz="2"/>
+              <w:right w:val="single" w:color="D9DCE3" w:sz="2"/>
+            </w:tcBorders>
+            <w:shd w:fill="F4F5F7" w:color="auto" w:val="clear"/>
+            <w:tcMar>
+              <w:top w:type="dxa" w:w="90"/>
+              <w:left w:type="dxa" w:w="110"/>
+              <w:bottom w:type="dxa" w:w="90"/>
+              <w:right w:type="dxa" w:w="110"/>
+            </w:tcMar>
+            <w:vAlign w:val="center"/>
+          </w:tcPr>
+          <w:p>
+            <w:r>
+              <w:rPr>
+                <w:rFonts w:ascii="Calibri" w:cs="Calibri" w:eastAsia="Calibri" w:hAnsi="Calibri"/>
+                <w:b/>
+                <w:bCs/>
+                <w:color w:val="5B6472"/>
+                <w:sz w:val="20"/>
+                <w:szCs w:val="20"/>
+              </w:rPr>
+              <w:t xml:space="preserve">●  </w:t>
+            </w:r>
+            <w:r>
+              <w:rPr>
+                <w:rFonts w:ascii="Calibri" w:cs="Calibri" w:eastAsia="Calibri" w:hAnsi="Calibri"/>
+                <w:b/>
+                <w:bCs/>
+                <w:color w:val="5B6472"/>
+                <w:sz w:val="20"/>
+                <w:szCs w:val="20"/>
+              </w:rPr>
+              <w:t xml:space="preserve">Cross-cutting / multiple themes</w:t>
+            </w:r>
+          </w:p>
+          <w:p>
+            <w:pPr>
+              <w:spacing w:before="30"/>
+            </w:pPr>
+            <w:r>
+              <w:rPr>
+                <w:rFonts w:ascii="Calibri" w:cs="Calibri" w:eastAsia="Calibri" w:hAnsi="Calibri"/>
+                <w:i/>
+                <w:iCs/>
+                <w:color w:val="5B6472"/>
+                <w:sz w:val="17"/>
+                <w:szCs w:val="17"/>
+              </w:rPr>
+              <w:t xml:space="preserve">sponsorship &amp; commercial partnerships — team-assigned, outside the five research themes</w:t>
+            </w:r>
+          </w:p>
+        </w:tc>
+      </w:tr>
+      <w:tr>
+        <w:tc>
+          <w:tcPr>
+            <w:tcW w:type="dxa" w:w="2900"/>
+            <w:tcBorders>
+              <w:top w:val="single" w:color="D9DCE3" w:sz="2"/>
+              <w:left w:val="single" w:color="D9DCE3" w:sz="2"/>
+              <w:bottom w:val="single" w:color="D9DCE3" w:sz="2"/>
+              <w:right w:val="single" w:color="D9DCE3" w:sz="2"/>
+            </w:tcBorders>
+            <w:shd w:fill="FFFFFF" w:color="auto" w:val="clear"/>
+            <w:tcMar>
+              <w:top w:type="dxa" w:w="90"/>
+              <w:left w:type="dxa" w:w="110"/>
+              <w:bottom w:type="dxa" w:w="90"/>
+              <w:right w:type="dxa" w:w="110"/>
+            </w:tcMar>
+            <w:vAlign w:val="center"/>
+          </w:tcPr>
+          <w:p>
+            <w:pPr>
+              <w:jc w:val="left"/>
+            </w:pPr>
+            <w:r>
+              <w:rPr>
+                <w:rFonts w:ascii="Calibri" w:cs="Calibri" w:eastAsia="Calibri" w:hAnsi="Calibri"/>
+                <w:b/>
+                <w:bCs/>
+                <w:color w:val="1A1A1A"/>
+                <w:sz w:val="20"/>
+                <w:szCs w:val="20"/>
+              </w:rPr>
+              <w:t xml:space="preserve">UVA Library</w:t>
+            </w:r>
+          </w:p>
+        </w:tc>
+        <w:tc>
+          <w:tcPr>
+            <w:tcW w:type="dxa" w:w="4740"/>
+            <w:tcBorders>
+              <w:top w:val="single" w:color="D9DCE3" w:sz="2"/>
+              <w:left w:val="single" w:color="D9DCE3" w:sz="2"/>
+              <w:bottom w:val="single" w:color="D9DCE3" w:sz="2"/>
+              <w:right w:val="single" w:color="D9DCE3" w:sz="2"/>
+            </w:tcBorders>
+            <w:shd w:fill="FFFFFF" w:color="auto" w:val="clear"/>
+            <w:tcMar>
+              <w:top w:type="dxa" w:w="90"/>
+              <w:left w:type="dxa" w:w="110"/>
+              <w:bottom w:type="dxa" w:w="90"/>
+              <w:right w:type="dxa" w:w="110"/>
+            </w:tcMar>
+            <w:vAlign w:val="center"/>
+          </w:tcPr>
+          <w:p>
+            <w:pPr>
+              <w:jc w:val="left"/>
+            </w:pPr>
+            <w:r>
+              <w:rPr>
+                <w:rFonts w:ascii="Calibri" w:cs="Calibri" w:eastAsia="Calibri" w:hAnsi="Calibri"/>
+                <w:b w:val="false"/>
+                <w:bCs w:val="false"/>
+                <w:color w:val="333333"/>
+                <w:sz w:val="20"/>
+                <w:szCs w:val="20"/>
+              </w:rPr>
               <w:t xml:space="preserve">Not assigned to a dedicated placement. Digital scholarship, research data services, and archival programs may be relevant to technology, publishing, or research-infrastructure partners; opportunities are assessed and routed by the team.</w:t>
             </w:r>
           </w:p>
@@ -1837,7 +1968,7 @@
               <w:bottom w:val="single" w:color="D9DCE3" w:sz="2"/>
               <w:right w:val="single" w:color="D9DCE3" w:sz="2"/>
             </w:tcBorders>
-            <w:shd w:fill="F4F5F7" w:color="auto" w:val="clear"/>
+            <w:shd w:fill="FFFFFF" w:color="auto" w:val="clear"/>
             <w:tcMar>
               <w:top w:type="dxa" w:w="90"/>
               <w:left w:type="dxa" w:w="110"/>

</xml_diff>